<commit_message>
docs(colaboradores): modulo de Gestion de Colaboradores (REQ-SIG-09)
Una sola tabla y un solo proceso para nomina y contratistas. El argumento
es empirico: de 38 personas activas solo 6 son de nomina, asi que tratar al
contratista como caso aparte deja fuera del control a la mayoria. Y es
correcto de fondo, porque la seguridad de la informacion no distingue el
tipo de contrato: mismo acuerdo, misma induccion, misma revocacion el mismo
dia, misma acta de borrado. Lo que cambia son afiliaciones y liquidacion.

Cinco artboards: lista con las cuatro anomalias que responde sola, ficha,
vinculacion con la puerta de accesos cerrada hasta firmar los cuatro
compromisos, desvinculacion donde ningun paso depende de otro, y el flujo
de leer, aceptar y firmar.

El acta de aceptacion se rehizo con los estilos de POL-SIG-03 -Montserrat
11, titulos 333399, encabezado de cuatro columnas con logo- y cabe en una
sola hoja, verificado contra Word.

Co-Authored-By: Claude Opus 5 <noreply@anthropic.com>
</commit_message>
<xml_diff>
--- a/docs/handoff_a/plantillas/Acta de aceptacion y firma - base.docx
+++ b/docs/handoff_a/plantillas/Acta de aceptacion y firma - base.docx
@@ -2,150 +2,17 @@
 <file path=word/document.xml><?xml version="1.0" encoding="utf-8"?>
 <w:document xmlns:wpc="http://schemas.microsoft.com/office/word/2010/wordprocessingCanvas" xmlns:mo="http://schemas.microsoft.com/office/mac/office/2008/main" xmlns:mc="http://schemas.openxmlformats.org/markup-compatibility/2006" xmlns:mv="urn:schemas-microsoft-com:mac:vml" xmlns:o="urn:schemas-microsoft-com:office:office" xmlns:r="http://schemas.openxmlformats.org/officeDocument/2006/relationships" xmlns:m="http://schemas.openxmlformats.org/officeDocument/2006/math" xmlns:v="urn:schemas-microsoft-com:vml" xmlns:wp14="http://schemas.microsoft.com/office/word/2010/wordprocessingDrawing" xmlns:wp="http://schemas.openxmlformats.org/drawingml/2006/wordprocessingDrawing" xmlns:w10="urn:schemas-microsoft-com:office:word" xmlns:w="http://schemas.openxmlformats.org/wordprocessingml/2006/main" xmlns:w14="http://schemas.microsoft.com/office/word/2010/wordml" xmlns:wpg="http://schemas.microsoft.com/office/word/2010/wordprocessingGroup" xmlns:wpi="http://schemas.microsoft.com/office/word/2010/wordprocessingInk" xmlns:wne="http://schemas.microsoft.com/office/word/2006/wordml" xmlns:wps="http://schemas.microsoft.com/office/word/2010/wordprocessingShape" mc:Ignorable="w14 wp14">
   <w:body>
-    <w:tbl>
-      <w:tblPr>
-        <w:tblStyle w:val="TableGrid"/>
-        <w:tblW w:type="auto" w:w="0"/>
-        <w:tblLook w:firstColumn="1" w:firstRow="1" w:lastColumn="0" w:lastRow="0" w:noHBand="0" w:noVBand="1" w:val="04A0"/>
-      </w:tblPr>
-      <w:tblGrid>
-        <w:gridCol w:w="4759"/>
-        <w:gridCol w:w="4759"/>
-      </w:tblGrid>
-      <w:tr>
-        <w:tc>
-          <w:tcPr>
-            <w:tcW w:type="dxa" w:w="4759"/>
-          </w:tcPr>
-          <w:p>
-            <w:r>
-              <w:rPr>
-                <w:b/>
-                <w:color w:val="12437F"/>
-                <w:sz w:val="30"/>
-              </w:rPr>
-              <w:t>CUANTICO</w:t>
-            </w:r>
-          </w:p>
-          <w:p>
-            <w:pPr>
-              <w:spacing w:before="0"/>
-            </w:pPr>
-            <w:r>
-              <w:rPr>
-                <w:color w:val="6B7570"/>
-                <w:sz w:val="17"/>
-              </w:rPr>
-              <w:t>Sistema Integrado de Gestion</w:t>
-            </w:r>
-          </w:p>
-        </w:tc>
-        <w:tc>
-          <w:tcPr>
-            <w:tcW w:type="dxa" w:w="4759"/>
-            <w:shd w:val="clear" w:color="auto" w:fill="F5F7F6"/>
-          </w:tcPr>
-          <w:p>
-            <w:pPr>
-              <w:spacing w:after="0" w:before="0"/>
-            </w:pPr>
-            <w:r>
-              <w:rPr>
-                <w:b/>
-                <w:color w:val="6B7570"/>
-                <w:sz w:val="17"/>
-              </w:rPr>
-              <w:t xml:space="preserve">Codigo: </w:t>
-            </w:r>
-            <w:r>
-              <w:rPr>
-                <w:sz w:val="17"/>
-              </w:rPr>
-              <w:t>{{codigo_formato}}</w:t>
-            </w:r>
-          </w:p>
-          <w:p>
-            <w:pPr>
-              <w:spacing w:after="0" w:before="0"/>
-            </w:pPr>
-            <w:r>
-              <w:rPr>
-                <w:b/>
-                <w:color w:val="6B7570"/>
-                <w:sz w:val="17"/>
-              </w:rPr>
-              <w:t xml:space="preserve">Version: </w:t>
-            </w:r>
-            <w:r>
-              <w:rPr>
-                <w:sz w:val="17"/>
-              </w:rPr>
-              <w:t>{{version_formato}}</w:t>
-            </w:r>
-          </w:p>
-          <w:p>
-            <w:pPr>
-              <w:spacing w:after="0" w:before="0"/>
-            </w:pPr>
-            <w:r>
-              <w:rPr>
-                <w:b/>
-                <w:color w:val="6B7570"/>
-                <w:sz w:val="17"/>
-              </w:rPr>
-              <w:t xml:space="preserve">Fecha: </w:t>
-            </w:r>
-            <w:r>
-              <w:rPr>
-                <w:sz w:val="17"/>
-              </w:rPr>
-              <w:t>{{fecha_formato}}</w:t>
-            </w:r>
-          </w:p>
-          <w:p>
-            <w:pPr>
-              <w:spacing w:after="0" w:before="0"/>
-            </w:pPr>
-            <w:r>
-              <w:rPr>
-                <w:b/>
-                <w:color w:val="6B7570"/>
-                <w:sz w:val="17"/>
-              </w:rPr>
-              <w:t xml:space="preserve">Clasificacion: </w:t>
-            </w:r>
-            <w:r>
-              <w:rPr>
-                <w:sz w:val="17"/>
-              </w:rPr>
-              <w:t>Privada</w:t>
-            </w:r>
-          </w:p>
-        </w:tc>
-      </w:tr>
-    </w:tbl>
     <w:p>
       <w:pPr>
-        <w:spacing w:before="320" w:after="40"/>
+        <w:spacing w:before="0" w:after="160"/>
         <w:jc w:val="center"/>
       </w:pPr>
       <w:r>
         <w:rPr>
+          <w:rFonts w:ascii="Montserrat" w:hAnsi="Montserrat"/>
           <w:b/>
-          <w:color w:val="12437F"/>
-          <w:sz w:val="32"/>
-        </w:rPr>
-        <w:t>ACTA DE ACEPTACION Y FIRMA</w:t>
-      </w:r>
-    </w:p>
-    <w:p>
-      <w:pPr>
-        <w:spacing w:after="80"/>
-        <w:jc w:val="center"/>
-      </w:pPr>
-      <w:r>
-        <w:rPr>
-          <w:color w:val="6B7570"/>
+          <w:i w:val="0"/>
+          <w:color w:val="0F9ED5"/>
           <w:sz w:val="20"/>
         </w:rPr>
         <w:t>{{acta_codigo}}</w:t>
@@ -153,56 +20,55 @@
     </w:p>
     <w:p>
       <w:pPr>
-        <w:spacing w:before="40" w:after="200"/>
+        <w:spacing w:before="280" w:after="80"/>
       </w:pPr>
       <w:r>
         <w:rPr>
-          <w:i/>
-          <w:color w:val="6B7570"/>
-          <w:sz w:val="18"/>
+          <w:rFonts w:ascii="Montserrat" w:hAnsi="Montserrat"/>
+          <w:b/>
+          <w:i w:val="0"/>
+          <w:color w:val="333399"/>
+          <w:sz w:val="22"/>
         </w:rPr>
-        <w:t>Este documento se genera automaticamente cuando una persona lee, acepta y firma un documento del Sistema Integrado de Gestion. No se diligencia a mano: los campos entre llaves los reemplaza la aplicacion en el momento de la aceptacion.</w:t>
-      </w:r>
-    </w:p>
-    <w:p>
-      <w:pPr>
-        <w:spacing w:before="280" w:after="100"/>
-      </w:pPr>
-      <w:r>
-        <w:rPr>
-          <w:b/>
-          <w:color w:val="12437F"/>
-          <w:sz w:val="26"/>
-        </w:rPr>
-        <w:t>1. Identificacion de quien firma</w:t>
+        <w:t>1. Quien firma</w:t>
       </w:r>
     </w:p>
     <w:tbl>
       <w:tblPr>
-        <w:tblStyle w:val="TableGrid"/>
         <w:tblW w:type="auto" w:w="0"/>
-        <w:jc w:val="center"/>
         <w:tblLook w:firstColumn="1" w:firstRow="1" w:lastColumn="0" w:lastRow="0" w:noHBand="0" w:noVBand="1" w:val="04A0"/>
+        <w:tblBorders>
+          <w:top w:val="single" w:sz="4" w:space="0" w:color="333399"/>
+          <w:left w:val="single" w:sz="4" w:space="0" w:color="333399"/>
+          <w:bottom w:val="single" w:sz="4" w:space="0" w:color="333399"/>
+          <w:right w:val="single" w:sz="4" w:space="0" w:color="333399"/>
+          <w:insideH w:val="single" w:sz="4" w:space="0" w:color="333399"/>
+          <w:insideV w:val="single" w:sz="4" w:space="0" w:color="333399"/>
+        </w:tblBorders>
       </w:tblPr>
       <w:tblGrid>
-        <w:gridCol w:w="4759"/>
-        <w:gridCol w:w="4759"/>
+        <w:gridCol w:w="2126"/>
+        <w:gridCol w:w="2126"/>
+        <w:gridCol w:w="2126"/>
+        <w:gridCol w:w="2126"/>
       </w:tblGrid>
       <w:tr>
         <w:tc>
           <w:tcPr>
-            <w:tcW w:type="dxa" w:w="3061"/>
-            <w:shd w:val="clear" w:color="auto" w:fill="F5F7F6"/>
+            <w:tcW w:type="dxa" w:w="1871"/>
+            <w:shd w:val="clear" w:color="auto" w:fill="F2F2F7"/>
           </w:tcPr>
           <w:p>
             <w:pPr>
-              <w:spacing w:after="40" w:before="40"/>
+              <w:spacing w:before="60" w:after="60"/>
             </w:pPr>
             <w:r>
               <w:rPr>
+                <w:rFonts w:ascii="Montserrat" w:hAnsi="Montserrat"/>
                 <w:b/>
-                <w:color w:val="6B7570"/>
-                <w:sz w:val="19"/>
+                <w:i w:val="0"/>
+                <w:color w:val="595959"/>
+                <w:sz w:val="16"/>
               </w:rPr>
               <w:t>Nombre completo</w:t>
             </w:r>
@@ -210,52 +76,60 @@
         </w:tc>
         <w:tc>
           <w:tcPr>
-            <w:tcW w:type="dxa" w:w="4759"/>
+            <w:tcW w:type="dxa" w:w="2381"/>
           </w:tcPr>
           <w:p>
             <w:pPr>
-              <w:spacing w:after="40" w:before="40"/>
+              <w:spacing w:before="60" w:after="60"/>
             </w:pPr>
             <w:r>
               <w:rPr>
-                <w:sz w:val="20"/>
+                <w:rFonts w:ascii="Montserrat" w:hAnsi="Montserrat"/>
+                <w:b w:val="0"/>
+                <w:i w:val="0"/>
+                <w:color w:val="000000"/>
+                <w:sz w:val="18"/>
               </w:rPr>
               <w:t>{{firmante_nombre}}</w:t>
             </w:r>
           </w:p>
         </w:tc>
-      </w:tr>
-      <w:tr>
         <w:tc>
           <w:tcPr>
-            <w:tcW w:type="dxa" w:w="3061"/>
-            <w:shd w:val="clear" w:color="auto" w:fill="F5F7F6"/>
+            <w:tcW w:type="dxa" w:w="1871"/>
+            <w:shd w:val="clear" w:color="auto" w:fill="F2F2F7"/>
           </w:tcPr>
           <w:p>
             <w:pPr>
-              <w:spacing w:after="40" w:before="40"/>
+              <w:spacing w:before="60" w:after="60"/>
             </w:pPr>
             <w:r>
               <w:rPr>
+                <w:rFonts w:ascii="Montserrat" w:hAnsi="Montserrat"/>
                 <w:b/>
-                <w:color w:val="6B7570"/>
-                <w:sz w:val="19"/>
+                <w:i w:val="0"/>
+                <w:color w:val="595959"/>
+                <w:sz w:val="16"/>
               </w:rPr>
-              <w:t>Documento de identidad</w:t>
+              <w:t>Documento</w:t>
             </w:r>
           </w:p>
         </w:tc>
         <w:tc>
           <w:tcPr>
-            <w:tcW w:type="dxa" w:w="4759"/>
+            <w:tcW w:type="dxa" w:w="2381"/>
           </w:tcPr>
           <w:p>
             <w:pPr>
-              <w:spacing w:after="40" w:before="40"/>
+              <w:spacing w:before="60" w:after="60"/>
             </w:pPr>
             <w:r>
               <w:rPr>
-                <w:sz w:val="20"/>
+                <w:rFonts w:ascii="Montserrat" w:hAnsi="Montserrat"/>
+                <w:b w:val="0"/>
+                <w:i w:val="0"/>
+                <w:color w:val="000000"/>
+                <w:sz w:val="18"/>
               </w:rPr>
               <w:t>{{firmante_documento}}</w:t>
             </w:r>
@@ -265,18 +139,20 @@
       <w:tr>
         <w:tc>
           <w:tcPr>
-            <w:tcW w:type="dxa" w:w="3061"/>
-            <w:shd w:val="clear" w:color="auto" w:fill="F5F7F6"/>
+            <w:tcW w:type="dxa" w:w="1871"/>
+            <w:shd w:val="clear" w:color="auto" w:fill="F2F2F7"/>
           </w:tcPr>
           <w:p>
             <w:pPr>
-              <w:spacing w:after="40" w:before="40"/>
+              <w:spacing w:before="60" w:after="60"/>
             </w:pPr>
             <w:r>
               <w:rPr>
+                <w:rFonts w:ascii="Montserrat" w:hAnsi="Montserrat"/>
                 <w:b/>
-                <w:color w:val="6B7570"/>
-                <w:sz w:val="19"/>
+                <w:i w:val="0"/>
+                <w:color w:val="595959"/>
+                <w:sz w:val="16"/>
               </w:rPr>
               <w:t>Cargo</w:t>
             </w:r>
@@ -284,36 +160,40 @@
         </w:tc>
         <w:tc>
           <w:tcPr>
-            <w:tcW w:type="dxa" w:w="4759"/>
+            <w:tcW w:type="dxa" w:w="2381"/>
           </w:tcPr>
           <w:p>
             <w:pPr>
-              <w:spacing w:after="40" w:before="40"/>
+              <w:spacing w:before="60" w:after="60"/>
             </w:pPr>
             <w:r>
               <w:rPr>
-                <w:sz w:val="20"/>
+                <w:rFonts w:ascii="Montserrat" w:hAnsi="Montserrat"/>
+                <w:b w:val="0"/>
+                <w:i w:val="0"/>
+                <w:color w:val="000000"/>
+                <w:sz w:val="18"/>
               </w:rPr>
               <w:t>{{firmante_cargo}}</w:t>
             </w:r>
           </w:p>
         </w:tc>
-      </w:tr>
-      <w:tr>
         <w:tc>
           <w:tcPr>
-            <w:tcW w:type="dxa" w:w="3061"/>
-            <w:shd w:val="clear" w:color="auto" w:fill="F5F7F6"/>
+            <w:tcW w:type="dxa" w:w="1871"/>
+            <w:shd w:val="clear" w:color="auto" w:fill="F2F2F7"/>
           </w:tcPr>
           <w:p>
             <w:pPr>
-              <w:spacing w:after="40" w:before="40"/>
+              <w:spacing w:before="60" w:after="60"/>
             </w:pPr>
             <w:r>
               <w:rPr>
+                <w:rFonts w:ascii="Montserrat" w:hAnsi="Montserrat"/>
                 <w:b/>
-                <w:color w:val="6B7570"/>
-                <w:sz w:val="19"/>
+                <w:i w:val="0"/>
+                <w:color w:val="595959"/>
+                <w:sz w:val="16"/>
               </w:rPr>
               <w:t>Proceso</w:t>
             </w:r>
@@ -321,15 +201,19 @@
         </w:tc>
         <w:tc>
           <w:tcPr>
-            <w:tcW w:type="dxa" w:w="4759"/>
+            <w:tcW w:type="dxa" w:w="2381"/>
           </w:tcPr>
           <w:p>
             <w:pPr>
-              <w:spacing w:after="40" w:before="40"/>
+              <w:spacing w:before="60" w:after="60"/>
             </w:pPr>
             <w:r>
               <w:rPr>
-                <w:sz w:val="20"/>
+                <w:rFonts w:ascii="Montserrat" w:hAnsi="Montserrat"/>
+                <w:b w:val="0"/>
+                <w:i w:val="0"/>
+                <w:color w:val="000000"/>
+                <w:sz w:val="18"/>
               </w:rPr>
               <w:t>{{firmante_proceso}}</w:t>
             </w:r>
@@ -339,18 +223,20 @@
       <w:tr>
         <w:tc>
           <w:tcPr>
-            <w:tcW w:type="dxa" w:w="3061"/>
-            <w:shd w:val="clear" w:color="auto" w:fill="F5F7F6"/>
+            <w:tcW w:type="dxa" w:w="1871"/>
+            <w:shd w:val="clear" w:color="auto" w:fill="F2F2F7"/>
           </w:tcPr>
           <w:p>
             <w:pPr>
-              <w:spacing w:after="40" w:before="40"/>
+              <w:spacing w:before="60" w:after="60"/>
             </w:pPr>
             <w:r>
               <w:rPr>
+                <w:rFonts w:ascii="Montserrat" w:hAnsi="Montserrat"/>
                 <w:b/>
-                <w:color w:val="6B7570"/>
-                <w:sz w:val="19"/>
+                <w:i w:val="0"/>
+                <w:color w:val="595959"/>
+                <w:sz w:val="16"/>
               </w:rPr>
               <w:t>Correo corporativo</w:t>
             </w:r>
@@ -358,52 +244,60 @@
         </w:tc>
         <w:tc>
           <w:tcPr>
-            <w:tcW w:type="dxa" w:w="4759"/>
+            <w:tcW w:type="dxa" w:w="2381"/>
           </w:tcPr>
           <w:p>
             <w:pPr>
-              <w:spacing w:after="40" w:before="40"/>
+              <w:spacing w:before="60" w:after="60"/>
             </w:pPr>
             <w:r>
               <w:rPr>
-                <w:sz w:val="20"/>
+                <w:rFonts w:ascii="Montserrat" w:hAnsi="Montserrat"/>
+                <w:b w:val="0"/>
+                <w:i w:val="0"/>
+                <w:color w:val="000000"/>
+                <w:sz w:val="18"/>
               </w:rPr>
               <w:t>{{firmante_correo}}</w:t>
             </w:r>
           </w:p>
         </w:tc>
-      </w:tr>
-      <w:tr>
         <w:tc>
           <w:tcPr>
-            <w:tcW w:type="dxa" w:w="3061"/>
-            <w:shd w:val="clear" w:color="auto" w:fill="F5F7F6"/>
+            <w:tcW w:type="dxa" w:w="1871"/>
+            <w:shd w:val="clear" w:color="auto" w:fill="F2F2F7"/>
           </w:tcPr>
           <w:p>
             <w:pPr>
-              <w:spacing w:after="40" w:before="40"/>
+              <w:spacing w:before="60" w:after="60"/>
             </w:pPr>
             <w:r>
               <w:rPr>
+                <w:rFonts w:ascii="Montserrat" w:hAnsi="Montserrat"/>
                 <w:b/>
-                <w:color w:val="6B7570"/>
-                <w:sz w:val="19"/>
+                <w:i w:val="0"/>
+                <w:color w:val="595959"/>
+                <w:sz w:val="16"/>
               </w:rPr>
-              <w:t>Tipo de vinculacion</w:t>
+              <w:t>Vinculación</w:t>
             </w:r>
           </w:p>
         </w:tc>
         <w:tc>
           <w:tcPr>
-            <w:tcW w:type="dxa" w:w="4759"/>
+            <w:tcW w:type="dxa" w:w="2381"/>
           </w:tcPr>
           <w:p>
             <w:pPr>
-              <w:spacing w:after="40" w:before="40"/>
+              <w:spacing w:before="60" w:after="60"/>
             </w:pPr>
             <w:r>
               <w:rPr>
-                <w:sz w:val="20"/>
+                <w:rFonts w:ascii="Montserrat" w:hAnsi="Montserrat"/>
+                <w:b w:val="0"/>
+                <w:i w:val="0"/>
+                <w:color w:val="000000"/>
+                <w:sz w:val="18"/>
               </w:rPr>
               <w:t>{{firmante_tipo_contrato}}</w:t>
             </w:r>
@@ -413,133 +307,116 @@
     </w:tbl>
     <w:p>
       <w:pPr>
-        <w:spacing w:before="280" w:after="100"/>
+        <w:spacing w:before="280" w:after="80"/>
       </w:pPr>
       <w:r>
         <w:rPr>
+          <w:rFonts w:ascii="Montserrat" w:hAnsi="Montserrat"/>
           <w:b/>
-          <w:color w:val="12437F"/>
-          <w:sz w:val="26"/>
+          <w:i w:val="0"/>
+          <w:color w:val="333399"/>
+          <w:sz w:val="22"/>
         </w:rPr>
         <w:t>2. Documento aceptado</w:t>
       </w:r>
     </w:p>
     <w:tbl>
       <w:tblPr>
-        <w:tblStyle w:val="TableGrid"/>
         <w:tblW w:type="auto" w:w="0"/>
-        <w:jc w:val="center"/>
         <w:tblLook w:firstColumn="1" w:firstRow="1" w:lastColumn="0" w:lastRow="0" w:noHBand="0" w:noVBand="1" w:val="04A0"/>
+        <w:tblBorders>
+          <w:top w:val="single" w:sz="4" w:space="0" w:color="333399"/>
+          <w:left w:val="single" w:sz="4" w:space="0" w:color="333399"/>
+          <w:bottom w:val="single" w:sz="4" w:space="0" w:color="333399"/>
+          <w:right w:val="single" w:sz="4" w:space="0" w:color="333399"/>
+          <w:insideH w:val="single" w:sz="4" w:space="0" w:color="333399"/>
+          <w:insideV w:val="single" w:sz="4" w:space="0" w:color="333399"/>
+        </w:tblBorders>
       </w:tblPr>
       <w:tblGrid>
-        <w:gridCol w:w="4759"/>
-        <w:gridCol w:w="4759"/>
+        <w:gridCol w:w="2126"/>
+        <w:gridCol w:w="2126"/>
+        <w:gridCol w:w="2126"/>
+        <w:gridCol w:w="2126"/>
       </w:tblGrid>
       <w:tr>
         <w:tc>
           <w:tcPr>
-            <w:tcW w:type="dxa" w:w="3061"/>
-            <w:shd w:val="clear" w:color="auto" w:fill="F5F7F6"/>
+            <w:tcW w:type="dxa" w:w="1871"/>
+            <w:shd w:val="clear" w:color="auto" w:fill="F2F2F7"/>
           </w:tcPr>
           <w:p>
             <w:pPr>
-              <w:spacing w:after="40" w:before="40"/>
+              <w:spacing w:before="60" w:after="60"/>
             </w:pPr>
             <w:r>
               <w:rPr>
+                <w:rFonts w:ascii="Montserrat" w:hAnsi="Montserrat"/>
                 <w:b/>
-                <w:color w:val="6B7570"/>
-                <w:sz w:val="19"/>
+                <w:i w:val="0"/>
+                <w:color w:val="595959"/>
+                <w:sz w:val="16"/>
               </w:rPr>
-              <w:t>Codigo</w:t>
+              <w:t>Código</w:t>
             </w:r>
           </w:p>
         </w:tc>
         <w:tc>
           <w:tcPr>
-            <w:tcW w:type="dxa" w:w="4759"/>
+            <w:tcW w:type="dxa" w:w="2381"/>
           </w:tcPr>
           <w:p>
             <w:pPr>
-              <w:spacing w:after="40" w:before="40"/>
+              <w:spacing w:before="60" w:after="60"/>
             </w:pPr>
             <w:r>
               <w:rPr>
-                <w:sz w:val="20"/>
+                <w:rFonts w:ascii="Montserrat" w:hAnsi="Montserrat"/>
+                <w:b w:val="0"/>
+                <w:i w:val="0"/>
+                <w:color w:val="000000"/>
+                <w:sz w:val="18"/>
               </w:rPr>
               <w:t>{{documento_codigo}}</w:t>
             </w:r>
           </w:p>
         </w:tc>
-      </w:tr>
-      <w:tr>
         <w:tc>
           <w:tcPr>
-            <w:tcW w:type="dxa" w:w="3061"/>
-            <w:shd w:val="clear" w:color="auto" w:fill="F5F7F6"/>
+            <w:tcW w:type="dxa" w:w="1871"/>
+            <w:shd w:val="clear" w:color="auto" w:fill="F2F2F7"/>
           </w:tcPr>
           <w:p>
             <w:pPr>
-              <w:spacing w:after="40" w:before="40"/>
+              <w:spacing w:before="60" w:after="60"/>
             </w:pPr>
             <w:r>
               <w:rPr>
+                <w:rFonts w:ascii="Montserrat" w:hAnsi="Montserrat"/>
                 <w:b/>
-                <w:color w:val="6B7570"/>
-                <w:sz w:val="19"/>
+                <w:i w:val="0"/>
+                <w:color w:val="595959"/>
+                <w:sz w:val="16"/>
               </w:rPr>
-              <w:t>Nombre</w:t>
+              <w:t>Versión leída</w:t>
             </w:r>
           </w:p>
         </w:tc>
         <w:tc>
           <w:tcPr>
-            <w:tcW w:type="dxa" w:w="4759"/>
+            <w:tcW w:type="dxa" w:w="2381"/>
           </w:tcPr>
           <w:p>
             <w:pPr>
-              <w:spacing w:after="40" w:before="40"/>
+              <w:spacing w:before="60" w:after="60"/>
             </w:pPr>
             <w:r>
               <w:rPr>
-                <w:sz w:val="20"/>
-              </w:rPr>
-              <w:t>{{documento_nombre}}</w:t>
-            </w:r>
-          </w:p>
-        </w:tc>
-      </w:tr>
-      <w:tr>
-        <w:tc>
-          <w:tcPr>
-            <w:tcW w:type="dxa" w:w="3061"/>
-            <w:shd w:val="clear" w:color="auto" w:fill="F5F7F6"/>
-          </w:tcPr>
-          <w:p>
-            <w:pPr>
-              <w:spacing w:after="40" w:before="40"/>
-            </w:pPr>
-            <w:r>
-              <w:rPr>
-                <w:b/>
-                <w:color w:val="6B7570"/>
-                <w:sz w:val="19"/>
-              </w:rPr>
-              <w:t>Version leida</w:t>
-            </w:r>
-          </w:p>
-        </w:tc>
-        <w:tc>
-          <w:tcPr>
-            <w:tcW w:type="dxa" w:w="4759"/>
-          </w:tcPr>
-          <w:p>
-            <w:pPr>
-              <w:spacing w:after="40" w:before="40"/>
-            </w:pPr>
-            <w:r>
-              <w:rPr>
-                <w:sz w:val="20"/>
+                <w:rFonts w:ascii="Montserrat" w:hAnsi="Montserrat"/>
+                <w:b w:val="0"/>
+                <w:i w:val="0"/>
+                <w:color w:val="000000"/>
+                <w:sz w:val="18"/>
               </w:rPr>
               <w:t>{{documento_version}}</w:t>
             </w:r>
@@ -549,73 +426,83 @@
       <w:tr>
         <w:tc>
           <w:tcPr>
-            <w:tcW w:type="dxa" w:w="3061"/>
-            <w:shd w:val="clear" w:color="auto" w:fill="F5F7F6"/>
+            <w:tcW w:type="dxa" w:w="1871"/>
+            <w:shd w:val="clear" w:color="auto" w:fill="F2F2F7"/>
           </w:tcPr>
           <w:p>
             <w:pPr>
-              <w:spacing w:after="40" w:before="40"/>
+              <w:spacing w:before="60" w:after="60"/>
             </w:pPr>
             <w:r>
               <w:rPr>
+                <w:rFonts w:ascii="Montserrat" w:hAnsi="Montserrat"/>
                 <w:b/>
-                <w:color w:val="6B7570"/>
-                <w:sz w:val="19"/>
+                <w:i w:val="0"/>
+                <w:color w:val="595959"/>
+                <w:sz w:val="16"/>
               </w:rPr>
-              <w:t>Huella del archivo (SHA-256)</w:t>
+              <w:t>Nombre</w:t>
             </w:r>
           </w:p>
         </w:tc>
         <w:tc>
           <w:tcPr>
-            <w:tcW w:type="dxa" w:w="4759"/>
+            <w:tcW w:type="dxa" w:w="2381"/>
           </w:tcPr>
           <w:p>
             <w:pPr>
-              <w:spacing w:after="40" w:before="40"/>
+              <w:spacing w:before="60" w:after="60"/>
             </w:pPr>
             <w:r>
               <w:rPr>
-                <w:sz w:val="20"/>
+                <w:rFonts w:ascii="Montserrat" w:hAnsi="Montserrat"/>
+                <w:b w:val="0"/>
+                <w:i w:val="0"/>
+                <w:color w:val="000000"/>
+                <w:sz w:val="18"/>
               </w:rPr>
-              <w:t>{{documento_hash}}</w:t>
-            </w:r>
-          </w:p>
-        </w:tc>
-      </w:tr>
-      <w:tr>
-        <w:tc>
-          <w:tcPr>
-            <w:tcW w:type="dxa" w:w="3061"/>
-            <w:shd w:val="clear" w:color="auto" w:fill="F5F7F6"/>
-          </w:tcPr>
-          <w:p>
-            <w:pPr>
-              <w:spacing w:after="40" w:before="40"/>
-            </w:pPr>
-            <w:r>
-              <w:rPr>
-                <w:b/>
-                <w:color w:val="6B7570"/>
-                <w:sz w:val="19"/>
-              </w:rPr>
-              <w:t>Ubicacion</w:t>
+              <w:t>{{documento_nombre}}</w:t>
             </w:r>
           </w:p>
         </w:tc>
         <w:tc>
           <w:tcPr>
-            <w:tcW w:type="dxa" w:w="4759"/>
+            <w:tcW w:type="dxa" w:w="1871"/>
+            <w:shd w:val="clear" w:color="auto" w:fill="F2F2F7"/>
           </w:tcPr>
           <w:p>
             <w:pPr>
-              <w:spacing w:after="40" w:before="40"/>
+              <w:spacing w:before="60" w:after="60"/>
             </w:pPr>
             <w:r>
               <w:rPr>
-                <w:sz w:val="20"/>
+                <w:rFonts w:ascii="Montserrat" w:hAnsi="Montserrat"/>
+                <w:b/>
+                <w:i w:val="0"/>
+                <w:color w:val="595959"/>
+                <w:sz w:val="16"/>
               </w:rPr>
-              <w:t>{{documento_enlace}}</w:t>
+              <w:t>Huella SHA-256</w:t>
+            </w:r>
+          </w:p>
+        </w:tc>
+        <w:tc>
+          <w:tcPr>
+            <w:tcW w:type="dxa" w:w="2381"/>
+          </w:tcPr>
+          <w:p>
+            <w:pPr>
+              <w:spacing w:before="60" w:after="60"/>
+            </w:pPr>
+            <w:r>
+              <w:rPr>
+                <w:rFonts w:ascii="Montserrat" w:hAnsi="Montserrat"/>
+                <w:b w:val="0"/>
+                <w:i w:val="0"/>
+                <w:color w:val="000000"/>
+                <w:sz w:val="18"/>
+              </w:rPr>
+              <w:t>{{documento_hash}}</w:t>
             </w:r>
           </w:p>
         </w:tc>
@@ -623,65 +510,53 @@
     </w:tbl>
     <w:p>
       <w:pPr>
-        <w:spacing w:before="80" w:after="120"/>
+        <w:spacing w:before="280" w:after="80"/>
       </w:pPr>
       <w:r>
         <w:rPr>
+          <w:rFonts w:ascii="Montserrat" w:hAnsi="Montserrat"/>
+          <w:b/>
           <w:i w:val="0"/>
-          <w:color w:val="6B7570"/>
-          <w:sz w:val="18"/>
+          <w:color w:val="333399"/>
+          <w:sz w:val="22"/>
         </w:rPr>
-        <w:t>La huella identifica el archivo exacto que se mostro. Si el documento se modifica despues, su huella cambia y esta acta sigue probando cual fue el texto aceptado.</w:t>
-      </w:r>
-    </w:p>
-    <w:p>
-      <w:pPr>
-        <w:spacing w:before="280" w:after="100"/>
-      </w:pPr>
-      <w:r>
-        <w:rPr>
-          <w:b/>
-          <w:color w:val="12437F"/>
-          <w:sz w:val="26"/>
-        </w:rPr>
-        <w:t>3. Declaracion aceptada</w:t>
-      </w:r>
-    </w:p>
-    <w:p>
-      <w:pPr>
-        <w:spacing w:before="0" w:after="160"/>
-      </w:pPr>
-      <w:r>
-        <w:rPr>
-          <w:i w:val="0"/>
-          <w:color w:val="6B7570"/>
-          <w:sz w:val="18"/>
-        </w:rPr>
-        <w:t>Este es el texto que la persona leyo y acepto. Se conserva dentro del acta, no se referencia: si la declaracion cambia para las firmas futuras, esta acta conserva la suya.</w:t>
+        <w:t>3. Declaración aceptada</w:t>
       </w:r>
     </w:p>
     <w:tbl>
       <w:tblPr>
-        <w:tblStyle w:val="TableGrid"/>
         <w:tblW w:type="auto" w:w="0"/>
         <w:tblLook w:firstColumn="1" w:firstRow="1" w:lastColumn="0" w:lastRow="0" w:noHBand="0" w:noVBand="1" w:val="04A0"/>
+        <w:tblBorders>
+          <w:top w:val="single" w:sz="4" w:space="0" w:color="333399"/>
+          <w:left w:val="single" w:sz="4" w:space="0" w:color="333399"/>
+          <w:bottom w:val="single" w:sz="4" w:space="0" w:color="333399"/>
+          <w:right w:val="single" w:sz="4" w:space="0" w:color="333399"/>
+          <w:insideH w:val="single" w:sz="4" w:space="0" w:color="333399"/>
+          <w:insideV w:val="single" w:sz="4" w:space="0" w:color="333399"/>
+        </w:tblBorders>
       </w:tblPr>
       <w:tblGrid>
-        <w:gridCol w:w="9518"/>
+        <w:gridCol w:w="8504"/>
       </w:tblGrid>
       <w:tr>
         <w:tc>
           <w:tcPr>
-            <w:tcW w:type="dxa" w:w="9518"/>
-            <w:shd w:val="clear" w:color="auto" w:fill="FBFCFB"/>
+            <w:tcW w:type="dxa" w:w="8504"/>
+            <w:shd w:val="clear" w:color="auto" w:fill="FAFAFC"/>
           </w:tcPr>
           <w:p>
             <w:pPr>
-              <w:spacing w:before="160" w:after="160"/>
+              <w:spacing w:before="220" w:after="220"/>
+              <w:jc w:val="both"/>
             </w:pPr>
             <w:r>
               <w:rPr>
-                <w:sz w:val="21"/>
+                <w:rFonts w:ascii="Montserrat" w:hAnsi="Montserrat"/>
+                <w:b w:val="0"/>
+                <w:i w:val="0"/>
+                <w:color w:val="000000"/>
+                <w:sz w:val="20"/>
               </w:rPr>
               <w:t>{{declaracion}}</w:t>
             </w:r>
@@ -691,69 +566,70 @@
     </w:tbl>
     <w:p>
       <w:pPr>
-        <w:spacing w:before="200" w:after="80"/>
+        <w:spacing w:before="40"/>
       </w:pPr>
       <w:r>
         <w:rPr>
-          <w:i w:val="0"/>
-          <w:color w:val="6B7570"/>
-          <w:sz w:val="18"/>
+          <w:rFonts w:ascii="Montserrat" w:hAnsi="Montserrat"/>
+          <w:b w:val="0"/>
+          <w:i/>
+          <w:color w:val="595959"/>
+          <w:sz w:val="15"/>
         </w:rPr>
-        <w:t>Texto por defecto, editable por el Sistema Integrado de Gestion:</w:t>
+        <w:t>Texto por defecto, editable por el Sistema Integrado de Gestión: «Declaro que recibí, leí y comprendí el documento identificado en el numeral 2, en la versión allí señalada; que tuve la oportunidad de resolver mis dudas antes de aceptarlo; y que me obligo a cumplir lo que en él se establece. Acepto que esta manifestación, realizada desde mi cuenta corporativa, constituye mi firma electrónica y produce los mismos efectos que una firma manuscrita.»</w:t>
       </w:r>
     </w:p>
     <w:p>
       <w:pPr>
-        <w:spacing w:before="0" w:after="80"/>
+        <w:spacing w:before="280" w:after="80"/>
       </w:pPr>
       <w:r>
         <w:rPr>
-          <w:i/>
-          <w:color w:val="1A211E"/>
-          <w:sz w:val="20"/>
+          <w:rFonts w:ascii="Montserrat" w:hAnsi="Montserrat"/>
+          <w:b/>
+          <w:i w:val="0"/>
+          <w:color w:val="333399"/>
+          <w:sz w:val="22"/>
         </w:rPr>
-        <w:t>Declaro que recibi, lei y comprendi el documento identificado en el numeral 2, en la version alli senalada; que tuve la oportunidad de resolver mis dudas antes de aceptarlo; y que me obligo a cumplir lo que en el se establece. Acepto que esta manifestacion, realizada desde mi cuenta corporativa, constituye mi firma electronica y produce los mismos efectos que una firma manuscrita.</w:t>
-      </w:r>
-    </w:p>
-    <w:p>
-      <w:pPr>
-        <w:spacing w:before="280" w:after="100"/>
-      </w:pPr>
-      <w:r>
-        <w:rPr>
-          <w:b/>
-          <w:color w:val="12437F"/>
-          <w:sz w:val="26"/>
-        </w:rPr>
-        <w:t>4. Constancia de la aceptacion</w:t>
+        <w:t>4. Constancia de la aceptación</w:t>
       </w:r>
     </w:p>
     <w:tbl>
       <w:tblPr>
-        <w:tblStyle w:val="TableGrid"/>
         <w:tblW w:type="auto" w:w="0"/>
-        <w:jc w:val="center"/>
         <w:tblLook w:firstColumn="1" w:firstRow="1" w:lastColumn="0" w:lastRow="0" w:noHBand="0" w:noVBand="1" w:val="04A0"/>
+        <w:tblBorders>
+          <w:top w:val="single" w:sz="4" w:space="0" w:color="333399"/>
+          <w:left w:val="single" w:sz="4" w:space="0" w:color="333399"/>
+          <w:bottom w:val="single" w:sz="4" w:space="0" w:color="333399"/>
+          <w:right w:val="single" w:sz="4" w:space="0" w:color="333399"/>
+          <w:insideH w:val="single" w:sz="4" w:space="0" w:color="333399"/>
+          <w:insideV w:val="single" w:sz="4" w:space="0" w:color="333399"/>
+        </w:tblBorders>
       </w:tblPr>
       <w:tblGrid>
-        <w:gridCol w:w="4759"/>
-        <w:gridCol w:w="4759"/>
+        <w:gridCol w:w="2126"/>
+        <w:gridCol w:w="2126"/>
+        <w:gridCol w:w="2126"/>
+        <w:gridCol w:w="2126"/>
       </w:tblGrid>
       <w:tr>
         <w:tc>
           <w:tcPr>
-            <w:tcW w:type="dxa" w:w="3061"/>
-            <w:shd w:val="clear" w:color="auto" w:fill="F5F7F6"/>
+            <w:tcW w:type="dxa" w:w="1871"/>
+            <w:shd w:val="clear" w:color="auto" w:fill="F2F2F7"/>
           </w:tcPr>
           <w:p>
             <w:pPr>
-              <w:spacing w:after="40" w:before="40"/>
+              <w:spacing w:before="60" w:after="60"/>
             </w:pPr>
             <w:r>
               <w:rPr>
+                <w:rFonts w:ascii="Montserrat" w:hAnsi="Montserrat"/>
                 <w:b/>
-                <w:color w:val="6B7570"/>
-                <w:sz w:val="19"/>
+                <w:i w:val="0"/>
+                <w:color w:val="595959"/>
+                <w:sz w:val="16"/>
               </w:rPr>
               <w:t>Fecha y hora</w:t>
             </w:r>
@@ -761,36 +637,40 @@
         </w:tc>
         <w:tc>
           <w:tcPr>
-            <w:tcW w:type="dxa" w:w="4759"/>
+            <w:tcW w:type="dxa" w:w="2381"/>
           </w:tcPr>
           <w:p>
             <w:pPr>
-              <w:spacing w:after="40" w:before="40"/>
+              <w:spacing w:before="60" w:after="60"/>
             </w:pPr>
             <w:r>
               <w:rPr>
-                <w:sz w:val="20"/>
+                <w:rFonts w:ascii="Montserrat" w:hAnsi="Montserrat"/>
+                <w:b w:val="0"/>
+                <w:i w:val="0"/>
+                <w:color w:val="000000"/>
+                <w:sz w:val="18"/>
               </w:rPr>
               <w:t>{{aceptado_en}}</w:t>
             </w:r>
           </w:p>
         </w:tc>
-      </w:tr>
-      <w:tr>
         <w:tc>
           <w:tcPr>
-            <w:tcW w:type="dxa" w:w="3061"/>
-            <w:shd w:val="clear" w:color="auto" w:fill="F5F7F6"/>
+            <w:tcW w:type="dxa" w:w="1871"/>
+            <w:shd w:val="clear" w:color="auto" w:fill="F2F2F7"/>
           </w:tcPr>
           <w:p>
             <w:pPr>
-              <w:spacing w:after="40" w:before="40"/>
+              <w:spacing w:before="60" w:after="60"/>
             </w:pPr>
             <w:r>
               <w:rPr>
+                <w:rFonts w:ascii="Montserrat" w:hAnsi="Montserrat"/>
                 <w:b/>
-                <w:color w:val="6B7570"/>
-                <w:sz w:val="19"/>
+                <w:i w:val="0"/>
+                <w:color w:val="595959"/>
+                <w:sz w:val="16"/>
               </w:rPr>
               <w:t>Zona horaria</w:t>
             </w:r>
@@ -798,15 +678,19 @@
         </w:tc>
         <w:tc>
           <w:tcPr>
-            <w:tcW w:type="dxa" w:w="4759"/>
+            <w:tcW w:type="dxa" w:w="2381"/>
           </w:tcPr>
           <w:p>
             <w:pPr>
-              <w:spacing w:after="40" w:before="40"/>
+              <w:spacing w:before="60" w:after="60"/>
             </w:pPr>
             <w:r>
               <w:rPr>
-                <w:sz w:val="20"/>
+                <w:rFonts w:ascii="Montserrat" w:hAnsi="Montserrat"/>
+                <w:b w:val="0"/>
+                <w:i w:val="0"/>
+                <w:color w:val="000000"/>
+                <w:sz w:val="18"/>
               </w:rPr>
               <w:t>{{zona_horaria}}</w:t>
             </w:r>
@@ -816,108 +700,81 @@
       <w:tr>
         <w:tc>
           <w:tcPr>
-            <w:tcW w:type="dxa" w:w="3061"/>
-            <w:shd w:val="clear" w:color="auto" w:fill="F5F7F6"/>
+            <w:tcW w:type="dxa" w:w="1871"/>
+            <w:shd w:val="clear" w:color="auto" w:fill="F2F2F7"/>
           </w:tcPr>
           <w:p>
             <w:pPr>
-              <w:spacing w:after="40" w:before="40"/>
+              <w:spacing w:before="60" w:after="60"/>
             </w:pPr>
             <w:r>
               <w:rPr>
+                <w:rFonts w:ascii="Montserrat" w:hAnsi="Montserrat"/>
                 <w:b/>
-                <w:color w:val="6B7570"/>
-                <w:sz w:val="19"/>
+                <w:i w:val="0"/>
+                <w:color w:val="595959"/>
+                <w:sz w:val="16"/>
               </w:rPr>
-              <w:t>Direccion IP de origen</w:t>
+              <w:t>Dirección IP</w:t>
             </w:r>
           </w:p>
         </w:tc>
         <w:tc>
           <w:tcPr>
-            <w:tcW w:type="dxa" w:w="4759"/>
+            <w:tcW w:type="dxa" w:w="2381"/>
           </w:tcPr>
           <w:p>
             <w:pPr>
-              <w:spacing w:after="40" w:before="40"/>
+              <w:spacing w:before="60" w:after="60"/>
             </w:pPr>
             <w:r>
               <w:rPr>
-                <w:sz w:val="20"/>
+                <w:rFonts w:ascii="Montserrat" w:hAnsi="Montserrat"/>
+                <w:b w:val="0"/>
+                <w:i w:val="0"/>
+                <w:color w:val="000000"/>
+                <w:sz w:val="18"/>
               </w:rPr>
               <w:t>{{ip_origen}}</w:t>
             </w:r>
           </w:p>
         </w:tc>
-      </w:tr>
-      <w:tr>
         <w:tc>
           <w:tcPr>
-            <w:tcW w:type="dxa" w:w="3061"/>
-            <w:shd w:val="clear" w:color="auto" w:fill="F5F7F6"/>
+            <w:tcW w:type="dxa" w:w="1871"/>
+            <w:shd w:val="clear" w:color="auto" w:fill="F2F2F7"/>
           </w:tcPr>
           <w:p>
             <w:pPr>
-              <w:spacing w:after="40" w:before="40"/>
+              <w:spacing w:before="60" w:after="60"/>
             </w:pPr>
             <w:r>
               <w:rPr>
+                <w:rFonts w:ascii="Montserrat" w:hAnsi="Montserrat"/>
                 <w:b/>
-                <w:color w:val="6B7570"/>
-                <w:sz w:val="19"/>
+                <w:i w:val="0"/>
+                <w:color w:val="595959"/>
+                <w:sz w:val="16"/>
               </w:rPr>
-              <w:t>Navegador y dispositivo</w:t>
+              <w:t>Sesión</w:t>
             </w:r>
           </w:p>
         </w:tc>
         <w:tc>
           <w:tcPr>
-            <w:tcW w:type="dxa" w:w="4759"/>
+            <w:tcW w:type="dxa" w:w="2381"/>
           </w:tcPr>
           <w:p>
             <w:pPr>
-              <w:spacing w:after="40" w:before="40"/>
+              <w:spacing w:before="60" w:after="60"/>
             </w:pPr>
             <w:r>
               <w:rPr>
-                <w:sz w:val="20"/>
-              </w:rPr>
-              <w:t>{{agente}}</w:t>
-            </w:r>
-          </w:p>
-        </w:tc>
-      </w:tr>
-      <w:tr>
-        <w:tc>
-          <w:tcPr>
-            <w:tcW w:type="dxa" w:w="3061"/>
-            <w:shd w:val="clear" w:color="auto" w:fill="F5F7F6"/>
-          </w:tcPr>
-          <w:p>
-            <w:pPr>
-              <w:spacing w:after="40" w:before="40"/>
-            </w:pPr>
-            <w:r>
-              <w:rPr>
-                <w:b/>
-                <w:color w:val="6B7570"/>
-                <w:sz w:val="19"/>
-              </w:rPr>
-              <w:t>Identificador de la sesion</w:t>
-            </w:r>
-          </w:p>
-        </w:tc>
-        <w:tc>
-          <w:tcPr>
-            <w:tcW w:type="dxa" w:w="4759"/>
-          </w:tcPr>
-          <w:p>
-            <w:pPr>
-              <w:spacing w:after="40" w:before="40"/>
-            </w:pPr>
-            <w:r>
-              <w:rPr>
-                <w:sz w:val="20"/>
+                <w:rFonts w:ascii="Montserrat" w:hAnsi="Montserrat"/>
+                <w:b w:val="0"/>
+                <w:i w:val="0"/>
+                <w:color w:val="000000"/>
+                <w:sz w:val="18"/>
               </w:rPr>
               <w:t>{{sesion_id}}</w:t>
             </w:r>
@@ -927,34 +784,81 @@
       <w:tr>
         <w:tc>
           <w:tcPr>
-            <w:tcW w:type="dxa" w:w="3061"/>
-            <w:shd w:val="clear" w:color="auto" w:fill="F5F7F6"/>
+            <w:tcW w:type="dxa" w:w="1871"/>
+            <w:shd w:val="clear" w:color="auto" w:fill="F2F2F7"/>
           </w:tcPr>
           <w:p>
             <w:pPr>
-              <w:spacing w:after="40" w:before="40"/>
+              <w:spacing w:before="60" w:after="60"/>
             </w:pPr>
             <w:r>
               <w:rPr>
+                <w:rFonts w:ascii="Montserrat" w:hAnsi="Montserrat"/>
                 <w:b/>
-                <w:color w:val="6B7570"/>
-                <w:sz w:val="19"/>
+                <w:i w:val="0"/>
+                <w:color w:val="595959"/>
+                <w:sz w:val="16"/>
               </w:rPr>
-              <w:t>Asignacion asociada</w:t>
+              <w:t>Navegador y equipo</w:t>
             </w:r>
           </w:p>
         </w:tc>
         <w:tc>
           <w:tcPr>
-            <w:tcW w:type="dxa" w:w="4759"/>
+            <w:tcW w:type="dxa" w:w="2381"/>
           </w:tcPr>
           <w:p>
             <w:pPr>
-              <w:spacing w:after="40" w:before="40"/>
+              <w:spacing w:before="60" w:after="60"/>
             </w:pPr>
             <w:r>
               <w:rPr>
-                <w:sz w:val="20"/>
+                <w:rFonts w:ascii="Montserrat" w:hAnsi="Montserrat"/>
+                <w:b w:val="0"/>
+                <w:i w:val="0"/>
+                <w:color w:val="000000"/>
+                <w:sz w:val="18"/>
+              </w:rPr>
+              <w:t>{{agente}}</w:t>
+            </w:r>
+          </w:p>
+        </w:tc>
+        <w:tc>
+          <w:tcPr>
+            <w:tcW w:type="dxa" w:w="1871"/>
+            <w:shd w:val="clear" w:color="auto" w:fill="F2F2F7"/>
+          </w:tcPr>
+          <w:p>
+            <w:pPr>
+              <w:spacing w:before="60" w:after="60"/>
+            </w:pPr>
+            <w:r>
+              <w:rPr>
+                <w:rFonts w:ascii="Montserrat" w:hAnsi="Montserrat"/>
+                <w:b/>
+                <w:i w:val="0"/>
+                <w:color w:val="595959"/>
+                <w:sz w:val="16"/>
+              </w:rPr>
+              <w:t>Asignación</w:t>
+            </w:r>
+          </w:p>
+        </w:tc>
+        <w:tc>
+          <w:tcPr>
+            <w:tcW w:type="dxa" w:w="2381"/>
+          </w:tcPr>
+          <w:p>
+            <w:pPr>
+              <w:spacing w:before="60" w:after="60"/>
+            </w:pPr>
+            <w:r>
+              <w:rPr>
+                <w:rFonts w:ascii="Montserrat" w:hAnsi="Montserrat"/>
+                <w:b w:val="0"/>
+                <w:i w:val="0"/>
+                <w:color w:val="000000"/>
+                <w:sz w:val="18"/>
               </w:rPr>
               <w:t>{{asignacion_codigo}}</w:t>
             </w:r>
@@ -964,69 +868,90 @@
     </w:tbl>
     <w:p>
       <w:pPr>
-        <w:spacing w:before="280" w:after="100"/>
+        <w:spacing w:before="280" w:after="80"/>
       </w:pPr>
       <w:r>
         <w:rPr>
+          <w:rFonts w:ascii="Montserrat" w:hAnsi="Montserrat"/>
           <w:b/>
-          <w:color w:val="12437F"/>
-          <w:sz w:val="26"/>
+          <w:i w:val="0"/>
+          <w:color w:val="333399"/>
+          <w:sz w:val="22"/>
         </w:rPr>
-        <w:t>5. Firma electronica</w:t>
+        <w:t>5. Firma electrónica</w:t>
       </w:r>
     </w:p>
     <w:p>
       <w:pPr>
-        <w:spacing w:before="0" w:after="120"/>
+        <w:spacing w:after="100"/>
+        <w:jc w:val="both"/>
       </w:pPr>
       <w:r>
         <w:rPr>
+          <w:rFonts w:ascii="Montserrat" w:hAnsi="Montserrat"/>
+          <w:b w:val="0"/>
           <w:i w:val="0"/>
-          <w:color w:val="6B7570"/>
-          <w:sz w:val="19"/>
+          <w:color w:val="595959"/>
+          <w:sz w:val="16"/>
         </w:rPr>
-        <w:t>La identidad de quien firma proviene de su autenticacion con la cuenta corporativa de CUANTICO. Se trata de una firma electronica simple: no interviene un certificado digital ni una entidad de certificacion. Su confiabilidad se sustenta en el control de acceso a la cuenta, en la trazabilidad registrada en el numeral 4 y en la inalterabilidad de esta acta.</w:t>
+        <w:t>La identidad de quien firma proviene de su autenticación con la cuenta corporativa de CUANTICO. Es una firma electrónica simple: no interviene un certificado digital ni una entidad de certificación. Su confiabilidad se sustenta en el control de acceso a la cuenta, en la trazabilidad del numeral 4 y en la inalterabilidad de esta acta.</w:t>
       </w:r>
     </w:p>
-    <w:p/>
     <w:tbl>
       <w:tblPr>
-        <w:tblStyle w:val="TableGrid"/>
         <w:tblW w:type="auto" w:w="0"/>
         <w:tblLook w:firstColumn="1" w:firstRow="1" w:lastColumn="0" w:lastRow="0" w:noHBand="0" w:noVBand="1" w:val="04A0"/>
+        <w:tblBorders>
+          <w:top w:val="single" w:sz="4" w:space="0" w:color="333399"/>
+          <w:left w:val="single" w:sz="4" w:space="0" w:color="333399"/>
+          <w:bottom w:val="single" w:sz="4" w:space="0" w:color="333399"/>
+          <w:right w:val="single" w:sz="4" w:space="0" w:color="333399"/>
+          <w:insideH w:val="single" w:sz="4" w:space="0" w:color="333399"/>
+          <w:insideV w:val="single" w:sz="4" w:space="0" w:color="333399"/>
+        </w:tblBorders>
       </w:tblPr>
       <w:tblGrid>
-        <w:gridCol w:w="4759"/>
-        <w:gridCol w:w="4759"/>
+        <w:gridCol w:w="4252"/>
+        <w:gridCol w:w="4252"/>
       </w:tblGrid>
       <w:tr>
         <w:tc>
           <w:tcPr>
-            <w:tcW w:type="dxa" w:w="4759"/>
-            <w:shd w:val="clear" w:color="auto" w:fill="F5F7F6"/>
+            <w:tcW w:type="dxa" w:w="4252"/>
+            <w:shd w:val="clear" w:color="auto" w:fill="F2F2F7"/>
           </w:tcPr>
           <w:p>
+            <w:pPr>
+              <w:spacing w:before="60" w:after="60"/>
+            </w:pPr>
             <w:r>
               <w:rPr>
+                <w:rFonts w:ascii="Montserrat" w:hAnsi="Montserrat"/>
                 <w:b/>
-                <w:color w:val="6B7570"/>
-                <w:sz w:val="18"/>
+                <w:i w:val="0"/>
+                <w:color w:val="595959"/>
+                <w:sz w:val="16"/>
               </w:rPr>
-              <w:t>Firma electronica de quien acepta</w:t>
+              <w:t>Firma electrónica de quien acepta</w:t>
             </w:r>
           </w:p>
         </w:tc>
         <w:tc>
           <w:tcPr>
-            <w:tcW w:type="dxa" w:w="4759"/>
-            <w:shd w:val="clear" w:color="auto" w:fill="F5F7F6"/>
+            <w:tcW w:type="dxa" w:w="4252"/>
+            <w:shd w:val="clear" w:color="auto" w:fill="F2F2F7"/>
           </w:tcPr>
           <w:p>
+            <w:pPr>
+              <w:spacing w:before="60" w:after="60"/>
+            </w:pPr>
             <w:r>
               <w:rPr>
+                <w:rFonts w:ascii="Montserrat" w:hAnsi="Montserrat"/>
                 <w:b/>
-                <w:color w:val="6B7570"/>
-                <w:sz w:val="18"/>
+                <w:i w:val="0"/>
+                <w:color w:val="595959"/>
+                <w:sz w:val="16"/>
               </w:rPr>
               <w:t>Constancia del sistema</w:t>
             </w:r>
@@ -1036,15 +961,19 @@
       <w:tr>
         <w:tc>
           <w:tcPr>
-            <w:tcW w:type="dxa" w:w="4759"/>
+            <w:tcW w:type="dxa" w:w="4252"/>
           </w:tcPr>
           <w:p>
             <w:pPr>
-              <w:spacing w:before="200" w:after="200"/>
+              <w:spacing w:before="240" w:after="240"/>
             </w:pPr>
             <w:r>
               <w:rPr>
-                <w:sz w:val="19"/>
+                <w:rFonts w:ascii="Montserrat" w:hAnsi="Montserrat"/>
+                <w:b w:val="0"/>
+                <w:i w:val="0"/>
+                <w:color w:val="000000"/>
+                <w:sz w:val="17"/>
               </w:rPr>
               <w:t>{{firmante_nombre}}</w:t>
             </w:r>
@@ -1053,16 +982,24 @@
             </w:r>
             <w:r>
               <w:rPr>
-                <w:sz w:val="19"/>
+                <w:rFonts w:ascii="Montserrat" w:hAnsi="Montserrat"/>
+                <w:b w:val="0"/>
+                <w:i w:val="0"/>
+                <w:color w:val="000000"/>
+                <w:sz w:val="17"/>
               </w:rPr>
-              <w:t>{{firmante_documento}}</w:t>
+              <w:t>C.C. {{firmante_documento}}</w:t>
             </w:r>
             <w:r>
               <w:br/>
             </w:r>
             <w:r>
               <w:rPr>
-                <w:sz w:val="19"/>
+                <w:rFonts w:ascii="Montserrat" w:hAnsi="Montserrat"/>
+                <w:b w:val="0"/>
+                <w:i w:val="0"/>
+                <w:color w:val="000000"/>
+                <w:sz w:val="17"/>
               </w:rPr>
               <w:t>{{aceptado_en}}</w:t>
             </w:r>
@@ -1070,24 +1007,32 @@
         </w:tc>
         <w:tc>
           <w:tcPr>
-            <w:tcW w:type="dxa" w:w="4759"/>
+            <w:tcW w:type="dxa" w:w="4252"/>
           </w:tcPr>
           <w:p>
             <w:pPr>
-              <w:spacing w:before="200" w:after="200"/>
+              <w:spacing w:before="240" w:after="240"/>
             </w:pPr>
             <w:r>
               <w:rPr>
-                <w:sz w:val="19"/>
+                <w:rFonts w:ascii="Montserrat" w:hAnsi="Montserrat"/>
+                <w:b w:val="0"/>
+                <w:i w:val="0"/>
+                <w:color w:val="000000"/>
+                <w:sz w:val="17"/>
               </w:rPr>
-              <w:t>Generada por SIG-CUANTICO</w:t>
+              <w:t>SIG-CUANTICO</w:t>
             </w:r>
             <w:r>
               <w:br/>
             </w:r>
             <w:r>
               <w:rPr>
-                <w:sz w:val="19"/>
+                <w:rFonts w:ascii="Montserrat" w:hAnsi="Montserrat"/>
+                <w:b w:val="0"/>
+                <w:i w:val="0"/>
+                <w:color w:val="000000"/>
+                <w:sz w:val="17"/>
               </w:rPr>
               <w:t>{{acta_codigo}}</w:t>
             </w:r>
@@ -1096,35 +1041,332 @@
             </w:r>
             <w:r>
               <w:rPr>
-                <w:sz w:val="19"/>
+                <w:rFonts w:ascii="Montserrat" w:hAnsi="Montserrat"/>
+                <w:b w:val="0"/>
+                <w:i w:val="0"/>
+                <w:color w:val="000000"/>
+                <w:sz w:val="17"/>
               </w:rPr>
-              <w:t>{{acta_hash}}</w:t>
+              <w:t>Huella SHA-256 {{acta_hash}}</w:t>
             </w:r>
           </w:p>
         </w:tc>
       </w:tr>
     </w:tbl>
-    <w:p>
-      <w:pPr>
-        <w:spacing w:before="240" w:after="120"/>
-      </w:pPr>
-      <w:r>
-        <w:rPr>
-          <w:i/>
-          <w:color w:val="6B7570"/>
-          <w:sz w:val="17"/>
-        </w:rPr>
-        <w:t>Documento generado automaticamente. Cualquier alteracion posterior invalida la huella del numeral 5 y, con ella, el valor probatorio de esta acta.</w:t>
-      </w:r>
-    </w:p>
     <w:sectPr>
-      <w:pgSz w:w="12240" w:h="15840"/>
-      <w:pgMar w:top="1247" w:right="1361" w:bottom="1134" w:left="1361" w:header="720" w:footer="720" w:gutter="0"/>
+      <w:headerReference w:type="default" r:id="rId9"/>
+      <w:footerReference w:type="default" r:id="rId10"/>
+      <w:pgSz w:w="11906" w:h="16838"/>
+      <w:pgMar w:top="1417" w:right="1701" w:bottom="1417" w:left="1701" w:header="567" w:footer="567" w:gutter="0"/>
       <w:cols w:space="720"/>
       <w:docGrid w:linePitch="360"/>
     </w:sectPr>
   </w:body>
 </w:document>
+</file>
+
+<file path=word/footer1.xml><?xml version="1.0" encoding="utf-8"?>
+<w:ftr xmlns:m="http://schemas.openxmlformats.org/officeDocument/2006/math" xmlns:mc="http://schemas.openxmlformats.org/markup-compatibility/2006" xmlns:mo="http://schemas.microsoft.com/office/mac/office/2008/main" xmlns:mv="urn:schemas-microsoft-com:mac:vml" xmlns:o="urn:schemas-microsoft-com:office:office" xmlns:r="http://schemas.openxmlformats.org/officeDocument/2006/relationships" xmlns:v="urn:schemas-microsoft-com:vml" xmlns:w10="urn:schemas-microsoft-com:office:word" xmlns:w14="http://schemas.microsoft.com/office/word/2010/wordml" xmlns:w="http://schemas.openxmlformats.org/wordprocessingml/2006/main" xmlns:wne="http://schemas.microsoft.com/office/word/2006/wordml" xmlns:wp14="http://schemas.microsoft.com/office/word/2010/wordprocessingDrawing" xmlns:wp="http://schemas.openxmlformats.org/drawingml/2006/wordprocessingDrawing" xmlns:wpc="http://schemas.microsoft.com/office/word/2010/wordprocessingCanvas" xmlns:wpg="http://schemas.microsoft.com/office/word/2010/wordprocessingGroup" xmlns:wpi="http://schemas.microsoft.com/office/word/2010/wordprocessingInk" xmlns:wps="http://schemas.microsoft.com/office/word/2010/wordprocessingShape" mc:Ignorable="w14 wp14">
+  <w:p>
+    <w:pPr>
+      <w:pStyle w:val="Footer"/>
+      <w:jc w:val="left"/>
+    </w:pPr>
+    <w:r>
+      <w:rPr>
+        <w:rFonts w:ascii="Montserrat" w:hAnsi="Montserrat"/>
+        <w:b w:val="0"/>
+        <w:i w:val="0"/>
+        <w:color w:val="595959"/>
+        <w:sz w:val="16"/>
+      </w:rPr>
+      <w:t>Clasificación: privada</w:t>
+    </w:r>
+  </w:p>
+  <w:p>
+    <w:pPr>
+      <w:spacing w:before="0"/>
+    </w:pPr>
+    <w:r>
+      <w:rPr>
+        <w:rFonts w:ascii="Montserrat" w:hAnsi="Montserrat"/>
+        <w:b w:val="0"/>
+        <w:i/>
+        <w:color w:val="595959"/>
+        <w:sz w:val="14"/>
+      </w:rPr>
+      <w:t>Documento generado automáticamente por SIG-CUANTICO. Cualquier alteración posterior invalida la huella del numeral 5 y, con ella, el valor probatorio de esta acta.</w:t>
+    </w:r>
+  </w:p>
+</w:ftr>
+</file>
+
+<file path=word/header1.xml><?xml version="1.0" encoding="utf-8"?>
+<w:hdr xmlns:m="http://schemas.openxmlformats.org/officeDocument/2006/math" xmlns:mc="http://schemas.openxmlformats.org/markup-compatibility/2006" xmlns:mo="http://schemas.microsoft.com/office/mac/office/2008/main" xmlns:mv="urn:schemas-microsoft-com:mac:vml" xmlns:o="urn:schemas-microsoft-com:office:office" xmlns:r="http://schemas.openxmlformats.org/officeDocument/2006/relationships" xmlns:v="urn:schemas-microsoft-com:vml" xmlns:w10="urn:schemas-microsoft-com:office:word" xmlns:w14="http://schemas.microsoft.com/office/word/2010/wordml" xmlns:w="http://schemas.openxmlformats.org/wordprocessingml/2006/main" xmlns:wne="http://schemas.microsoft.com/office/word/2006/wordml" xmlns:wp14="http://schemas.microsoft.com/office/word/2010/wordprocessingDrawing" xmlns:wp="http://schemas.openxmlformats.org/drawingml/2006/wordprocessingDrawing" xmlns:wpc="http://schemas.microsoft.com/office/word/2010/wordprocessingCanvas" xmlns:wpg="http://schemas.microsoft.com/office/word/2010/wordprocessingGroup" xmlns:wpi="http://schemas.microsoft.com/office/word/2010/wordprocessingInk" xmlns:wps="http://schemas.microsoft.com/office/word/2010/wordprocessingShape" mc:Ignorable="w14 wp14">
+  <w:p>
+    <w:pPr>
+      <w:pStyle w:val="Header"/>
+    </w:pPr>
+    <w:r/>
+  </w:p>
+  <w:tbl>
+    <w:tblPr>
+      <w:tblW w:type="auto" w:w="0"/>
+      <w:tblLayout w:type="fixed"/>
+      <w:tblLook w:firstColumn="1" w:firstRow="1" w:lastColumn="0" w:lastRow="0" w:noHBand="0" w:noVBand="1" w:val="04A0"/>
+      <w:tblBorders>
+        <w:top w:val="single" w:sz="4" w:space="0" w:color="333399"/>
+        <w:left w:val="single" w:sz="4" w:space="0" w:color="333399"/>
+        <w:bottom w:val="single" w:sz="4" w:space="0" w:color="333399"/>
+        <w:right w:val="single" w:sz="4" w:space="0" w:color="333399"/>
+        <w:insideH w:val="single" w:sz="4" w:space="0" w:color="333399"/>
+        <w:insideV w:val="single" w:sz="4" w:space="0" w:color="333399"/>
+      </w:tblBorders>
+    </w:tblPr>
+    <w:tblGrid>
+      <w:gridCol w:w="2126"/>
+      <w:gridCol w:w="2126"/>
+      <w:gridCol w:w="2126"/>
+      <w:gridCol w:w="2126"/>
+    </w:tblGrid>
+    <w:tr>
+      <w:tc>
+        <w:tcPr>
+          <w:tcW w:type="dxa" w:w="1729"/>
+          <w:vMerge w:val="restart"/>
+          <w:vAlign w:val="center"/>
+        </w:tcPr>
+        <w:p>
+          <w:pPr>
+            <w:spacing w:before="40" w:after="40"/>
+            <w:jc w:val="center"/>
+          </w:pPr>
+          <w:r>
+            <w:drawing>
+              <wp:inline xmlns:a="http://schemas.openxmlformats.org/drawingml/2006/main" xmlns:pic="http://schemas.openxmlformats.org/drawingml/2006/picture">
+                <wp:extent cx="1044000" cy="1001698"/>
+                <wp:docPr id="1" name="Picture 1"/>
+                <wp:cNvGraphicFramePr>
+                  <a:graphicFrameLocks noChangeAspect="1"/>
+                </wp:cNvGraphicFramePr>
+                <a:graphic>
+                  <a:graphicData uri="http://schemas.openxmlformats.org/drawingml/2006/picture">
+                    <pic:pic>
+                      <pic:nvPicPr>
+                        <pic:cNvPr id="0" name="logo-cuantico.jpg"/>
+                        <pic:cNvPicPr/>
+                      </pic:nvPicPr>
+                      <pic:blipFill>
+                        <a:blip r:embed="rId1"/>
+                        <a:stretch>
+                          <a:fillRect/>
+                        </a:stretch>
+                      </pic:blipFill>
+                      <pic:spPr>
+                        <a:xfrm>
+                          <a:off x="0" y="0"/>
+                          <a:ext cx="1044000" cy="1001698"/>
+                        </a:xfrm>
+                        <a:prstGeom prst="rect"/>
+                      </pic:spPr>
+                    </pic:pic>
+                  </a:graphicData>
+                </a:graphic>
+              </wp:inline>
+            </w:drawing>
+          </w:r>
+        </w:p>
+      </w:tc>
+      <w:tc>
+        <w:tcPr>
+          <w:tcW w:type="dxa" w:w="3600"/>
+          <w:vMerge w:val="restart"/>
+          <w:vAlign w:val="center"/>
+        </w:tcPr>
+        <w:p>
+          <w:pPr>
+            <w:jc w:val="center"/>
+          </w:pPr>
+          <w:r>
+            <w:rPr>
+              <w:rFonts w:ascii="Montserrat" w:hAnsi="Montserrat"/>
+              <w:b/>
+              <w:i w:val="0"/>
+              <w:color w:val="333399"/>
+              <w:sz w:val="22"/>
+            </w:rPr>
+            <w:t>ACTA DE ACEPTACIÓN Y FIRMA</w:t>
+          </w:r>
+        </w:p>
+      </w:tc>
+      <w:tc>
+        <w:tcPr>
+          <w:tcW w:type="dxa" w:w="1077"/>
+          <w:vAlign w:val="center"/>
+          <w:shd w:val="clear" w:color="auto" w:fill="F2F2F7"/>
+        </w:tcPr>
+        <w:p>
+          <w:pPr>
+            <w:spacing w:before="60" w:after="60"/>
+          </w:pPr>
+          <w:r>
+            <w:rPr>
+              <w:rFonts w:ascii="Montserrat" w:hAnsi="Montserrat"/>
+              <w:b/>
+              <w:i w:val="0"/>
+              <w:color w:val="595959"/>
+              <w:sz w:val="16"/>
+            </w:rPr>
+            <w:t>Código</w:t>
+          </w:r>
+        </w:p>
+      </w:tc>
+      <w:tc>
+        <w:tcPr>
+          <w:tcW w:type="dxa" w:w="2098"/>
+          <w:vAlign w:val="center"/>
+        </w:tcPr>
+        <w:p>
+          <w:pPr>
+            <w:spacing w:before="60" w:after="60"/>
+          </w:pPr>
+          <w:r>
+            <w:rPr>
+              <w:rFonts w:ascii="Montserrat" w:hAnsi="Montserrat"/>
+              <w:b w:val="0"/>
+              <w:i w:val="0"/>
+              <w:color w:val="000000"/>
+              <w:sz w:val="16"/>
+            </w:rPr>
+            <w:t>{{codigo_formato}}</w:t>
+          </w:r>
+        </w:p>
+      </w:tc>
+    </w:tr>
+    <w:tr>
+      <w:tc>
+        <w:tcPr>
+          <w:tcW w:type="dxa" w:w="1729"/>
+          <w:vMerge/>
+          <w:vAlign w:val="center"/>
+        </w:tcPr>
+        <w:p/>
+      </w:tc>
+      <w:tc>
+        <w:tcPr>
+          <w:tcW w:type="dxa" w:w="3600"/>
+          <w:vMerge/>
+          <w:vAlign w:val="center"/>
+        </w:tcPr>
+        <w:p/>
+      </w:tc>
+      <w:tc>
+        <w:tcPr>
+          <w:tcW w:type="dxa" w:w="1077"/>
+          <w:vAlign w:val="center"/>
+          <w:shd w:val="clear" w:color="auto" w:fill="F2F2F7"/>
+        </w:tcPr>
+        <w:p>
+          <w:pPr>
+            <w:spacing w:before="60" w:after="60"/>
+          </w:pPr>
+          <w:r>
+            <w:rPr>
+              <w:rFonts w:ascii="Montserrat" w:hAnsi="Montserrat"/>
+              <w:b/>
+              <w:i w:val="0"/>
+              <w:color w:val="595959"/>
+              <w:sz w:val="16"/>
+            </w:rPr>
+            <w:t>Versión</w:t>
+          </w:r>
+        </w:p>
+      </w:tc>
+      <w:tc>
+        <w:tcPr>
+          <w:tcW w:type="dxa" w:w="2098"/>
+          <w:vAlign w:val="center"/>
+        </w:tcPr>
+        <w:p>
+          <w:pPr>
+            <w:spacing w:before="60" w:after="60"/>
+          </w:pPr>
+          <w:r>
+            <w:rPr>
+              <w:rFonts w:ascii="Montserrat" w:hAnsi="Montserrat"/>
+              <w:b w:val="0"/>
+              <w:i w:val="0"/>
+              <w:color w:val="000000"/>
+              <w:sz w:val="16"/>
+            </w:rPr>
+            <w:t>{{version_formato}}</w:t>
+          </w:r>
+        </w:p>
+      </w:tc>
+    </w:tr>
+    <w:tr>
+      <w:tc>
+        <w:tcPr>
+          <w:tcW w:type="dxa" w:w="1729"/>
+          <w:vMerge/>
+          <w:vAlign w:val="center"/>
+        </w:tcPr>
+        <w:p/>
+      </w:tc>
+      <w:tc>
+        <w:tcPr>
+          <w:tcW w:type="dxa" w:w="3600"/>
+          <w:vMerge/>
+          <w:vAlign w:val="center"/>
+        </w:tcPr>
+        <w:p/>
+      </w:tc>
+      <w:tc>
+        <w:tcPr>
+          <w:tcW w:type="dxa" w:w="1077"/>
+          <w:vAlign w:val="center"/>
+          <w:shd w:val="clear" w:color="auto" w:fill="F2F2F7"/>
+        </w:tcPr>
+        <w:p>
+          <w:pPr>
+            <w:spacing w:before="60" w:after="60"/>
+          </w:pPr>
+          <w:r>
+            <w:rPr>
+              <w:rFonts w:ascii="Montserrat" w:hAnsi="Montserrat"/>
+              <w:b/>
+              <w:i w:val="0"/>
+              <w:color w:val="595959"/>
+              <w:sz w:val="16"/>
+            </w:rPr>
+            <w:t>Fecha</w:t>
+          </w:r>
+        </w:p>
+      </w:tc>
+      <w:tc>
+        <w:tcPr>
+          <w:tcW w:type="dxa" w:w="2098"/>
+          <w:vAlign w:val="center"/>
+        </w:tcPr>
+        <w:p>
+          <w:pPr>
+            <w:spacing w:before="60" w:after="60"/>
+          </w:pPr>
+          <w:r>
+            <w:rPr>
+              <w:rFonts w:ascii="Montserrat" w:hAnsi="Montserrat"/>
+              <w:b w:val="0"/>
+              <w:i w:val="0"/>
+              <w:color w:val="000000"/>
+              <w:sz w:val="16"/>
+            </w:rPr>
+            <w:t>{{fecha_formato}}</w:t>
+          </w:r>
+        </w:p>
+      </w:tc>
+    </w:tr>
+  </w:tbl>
+</w:hdr>
 </file>
 
 <file path=word/numbering.xml><?xml version="1.0" encoding="utf-8"?>
@@ -1491,12 +1733,12 @@
     <w:qFormat/>
     <w:rsid w:val="00FC693F"/>
     <w:pPr>
-      <w:spacing w:after="120" w:line="276" w:lineRule="auto"/>
+      <w:spacing w:after="80" w:line="254" w:lineRule="auto"/>
     </w:pPr>
     <w:rPr>
-      <w:rFonts w:ascii="Calibri" w:hAnsi="Calibri" w:eastAsia="Calibri"/>
-      <w:color w:val="1A211E"/>
-      <w:sz w:val="21"/>
+      <w:rFonts w:ascii="Montserrat" w:hAnsi="Montserrat" w:eastAsia="Montserrat" w:cs="Montserrat"/>
+      <w:color w:val="000000"/>
+      <w:sz w:val="22"/>
     </w:rPr>
   </w:style>
   <w:style w:type="paragraph" w:styleId="Header">

</xml_diff>